<commit_message>
docs(tp): regenerar los Word del TP desde el markdown actualizado
Dos documentos se habian quedado con la version de junio: el de
requerimientos y el del diagrama entidad-relacion, que son justamente los dos
que se actualizaron al documentar la verificacion de correo. El .docx del DER
no mencionaba la tabla codigos_verificacion.

Ademas, 07-presentacion-prototipo no tenia .docx en absoluto: el conversor
nunca lo habia tenido en su lista de documentos. Se agrega.

Quedan los siete regenerados y verificados: el del DER ya incluye la tabla
nueva y el de requerimientos las lineas sobre verificacion.

Nota: word/01-requerimientos.pdf sigue siendo el de junio. Es la unica
exportacion a PDF de esta carpeta y se genero desde Word, que no esta
disponible por linea de comandos; hay que reexportarla a mano ahora que el
.docx esta al dia.
</commit_message>
<xml_diff>
--- a/docs/2-requerimientos/word/04-diagrama-entidad-relacion.docx
+++ b/docs/2-requerimientos/word/04-diagrama-entidad-relacion.docx
@@ -620,6 +620,18 @@
           <w:rFonts w:ascii="Consolas" w:hAnsi="Consolas"/>
           <w:sz w:val="16"/>
         </w:rPr>
+        <w:t xml:space="preserve">    usuarios ||--o{ codigos_verificacion : "recibe códigos"</w:t>
+      </w:r>
+    </w:p>
+    <w:p>
+      <w:pPr>
+        <w:spacing w:after="0" w:before="0"/>
+      </w:pPr>
+      <w:r>
+        <w:rPr>
+          <w:rFonts w:ascii="Consolas" w:hAnsi="Consolas"/>
+          <w:sz w:val="16"/>
+        </w:rPr>
         <w:t xml:space="preserve"> </w:t>
       </w:r>
     </w:p>
@@ -908,6 +920,30 @@
           <w:rFonts w:ascii="Consolas" w:hAnsi="Consolas"/>
           <w:sz w:val="16"/>
         </w:rPr>
+        <w:t xml:space="preserve">        varchar email</w:t>
+      </w:r>
+    </w:p>
+    <w:p>
+      <w:pPr>
+        <w:spacing w:after="0" w:before="0"/>
+      </w:pPr>
+      <w:r>
+        <w:rPr>
+          <w:rFonts w:ascii="Consolas" w:hAnsi="Consolas"/>
+          <w:sz w:val="16"/>
+        </w:rPr>
+        <w:t xml:space="preserve">        timestamp email_verificado_en "NULL = sin verificar"</w:t>
+      </w:r>
+    </w:p>
+    <w:p>
+      <w:pPr>
+        <w:spacing w:after="0" w:before="0"/>
+      </w:pPr>
+      <w:r>
+        <w:rPr>
+          <w:rFonts w:ascii="Consolas" w:hAnsi="Consolas"/>
+          <w:sz w:val="16"/>
+        </w:rPr>
         <w:t xml:space="preserve">        varchar password_hash "BCrypt"</w:t>
       </w:r>
     </w:p>
@@ -921,6 +957,150 @@
           <w:sz w:val="16"/>
         </w:rPr>
         <w:t xml:space="preserve">        boolean activo</w:t>
+      </w:r>
+    </w:p>
+    <w:p>
+      <w:pPr>
+        <w:spacing w:after="0" w:before="0"/>
+      </w:pPr>
+      <w:r>
+        <w:rPr>
+          <w:rFonts w:ascii="Consolas" w:hAnsi="Consolas"/>
+          <w:sz w:val="16"/>
+        </w:rPr>
+        <w:t xml:space="preserve">        timestamp ultimo_login</w:t>
+      </w:r>
+    </w:p>
+    <w:p>
+      <w:pPr>
+        <w:spacing w:after="0" w:before="0"/>
+      </w:pPr>
+      <w:r>
+        <w:rPr>
+          <w:rFonts w:ascii="Consolas" w:hAnsi="Consolas"/>
+          <w:sz w:val="16"/>
+        </w:rPr>
+        <w:t xml:space="preserve">    }</w:t>
+      </w:r>
+    </w:p>
+    <w:p>
+      <w:pPr>
+        <w:spacing w:after="0" w:before="0"/>
+      </w:pPr>
+      <w:r>
+        <w:rPr>
+          <w:rFonts w:ascii="Consolas" w:hAnsi="Consolas"/>
+          <w:sz w:val="16"/>
+        </w:rPr>
+        <w:t xml:space="preserve">    codigos_verificacion {</w:t>
+      </w:r>
+    </w:p>
+    <w:p>
+      <w:pPr>
+        <w:spacing w:after="0" w:before="0"/>
+      </w:pPr>
+      <w:r>
+        <w:rPr>
+          <w:rFonts w:ascii="Consolas" w:hAnsi="Consolas"/>
+          <w:sz w:val="16"/>
+        </w:rPr>
+        <w:t xml:space="preserve">        bigint id PK</w:t>
+      </w:r>
+    </w:p>
+    <w:p>
+      <w:pPr>
+        <w:spacing w:after="0" w:before="0"/>
+      </w:pPr>
+      <w:r>
+        <w:rPr>
+          <w:rFonts w:ascii="Consolas" w:hAnsi="Consolas"/>
+          <w:sz w:val="16"/>
+        </w:rPr>
+        <w:t xml:space="preserve">        bigint institucion_id FK</w:t>
+      </w:r>
+    </w:p>
+    <w:p>
+      <w:pPr>
+        <w:spacing w:after="0" w:before="0"/>
+      </w:pPr>
+      <w:r>
+        <w:rPr>
+          <w:rFonts w:ascii="Consolas" w:hAnsi="Consolas"/>
+          <w:sz w:val="16"/>
+        </w:rPr>
+        <w:t xml:space="preserve">        bigint usuario_id FK</w:t>
+      </w:r>
+    </w:p>
+    <w:p>
+      <w:pPr>
+        <w:spacing w:after="0" w:before="0"/>
+      </w:pPr>
+      <w:r>
+        <w:rPr>
+          <w:rFonts w:ascii="Consolas" w:hAnsi="Consolas"/>
+          <w:sz w:val="16"/>
+        </w:rPr>
+        <w:t xml:space="preserve">        varchar proposito "VERIFICACION_EMAIL | RECUPERACION_PASSWORD"</w:t>
+      </w:r>
+    </w:p>
+    <w:p>
+      <w:pPr>
+        <w:spacing w:after="0" w:before="0"/>
+      </w:pPr>
+      <w:r>
+        <w:rPr>
+          <w:rFonts w:ascii="Consolas" w:hAnsi="Consolas"/>
+          <w:sz w:val="16"/>
+        </w:rPr>
+        <w:t xml:space="preserve">        varchar email "a qué buzón se envió"</w:t>
+      </w:r>
+    </w:p>
+    <w:p>
+      <w:pPr>
+        <w:spacing w:after="0" w:before="0"/>
+      </w:pPr>
+      <w:r>
+        <w:rPr>
+          <w:rFonts w:ascii="Consolas" w:hAnsi="Consolas"/>
+          <w:sz w:val="16"/>
+        </w:rPr>
+        <w:t xml:space="preserve">        varchar codigo_hash "nunca en texto plano"</w:t>
+      </w:r>
+    </w:p>
+    <w:p>
+      <w:pPr>
+        <w:spacing w:after="0" w:before="0"/>
+      </w:pPr>
+      <w:r>
+        <w:rPr>
+          <w:rFonts w:ascii="Consolas" w:hAnsi="Consolas"/>
+          <w:sz w:val="16"/>
+        </w:rPr>
+        <w:t xml:space="preserve">        timestamp expira_en</w:t>
+      </w:r>
+    </w:p>
+    <w:p>
+      <w:pPr>
+        <w:spacing w:after="0" w:before="0"/>
+      </w:pPr>
+      <w:r>
+        <w:rPr>
+          <w:rFonts w:ascii="Consolas" w:hAnsi="Consolas"/>
+          <w:sz w:val="16"/>
+        </w:rPr>
+        <w:t xml:space="preserve">        timestamp usado_en "NOT NULL = ya consumido"</w:t>
+      </w:r>
+    </w:p>
+    <w:p>
+      <w:pPr>
+        <w:spacing w:after="0" w:before="0"/>
+      </w:pPr>
+      <w:r>
+        <w:rPr>
+          <w:rFonts w:ascii="Consolas" w:hAnsi="Consolas"/>
+          <w:sz w:val="16"/>
+        </w:rPr>
+        <w:t xml:space="preserve">        smallint intentos</w:t>
       </w:r>
     </w:p>
     <w:p>
@@ -2143,6 +2323,40 @@
     <w:p>
       <w:r>
         <w:t>institución y tienen un rol. La contraseña se guarda con BCrypt.</w:t>
+      </w:r>
+    </w:p>
+    <w:p>
+      <w:pPr>
+        <w:pStyle w:val="ListBullet"/>
+      </w:pPr>
+      <w:r>
+        <w:rPr>
+          <w:b/>
+        </w:rPr>
+        <w:t>codigos_verificacion</w:t>
+      </w:r>
+      <w:r>
+        <w:t xml:space="preserve"> — Códigos de un solo uso enviados por correo, tanto</w:t>
+      </w:r>
+    </w:p>
+    <w:p>
+      <w:r>
+        <w:t>para confirmar que la persona controla su buzón como para recuperar la</w:t>
+      </w:r>
+    </w:p>
+    <w:p>
+      <w:r>
+        <w:t>contraseña olvidada. El código se guarda hasheado, vence a los 15 minutos, se</w:t>
+      </w:r>
+    </w:p>
+    <w:p>
+      <w:r>
+        <w:t>consume en el primer uso y lleva contador de intentos: seis dígitos son un</w:t>
+      </w:r>
+    </w:p>
+    <w:p>
+      <w:r>
+        <w:t>millón de combinaciones, y sin ese tope se probarían por fuerza bruta.</w:t>
       </w:r>
     </w:p>
     <w:p>

</xml_diff>